<commit_message>
Corrige o nome cortado na assinatura do recibo
A linha da assinatura era uma fileira de underscores de largura
fixa. Em nome de cliente longo ela empurrava o texto para fora da
celula, e o nome saia cortado na borda direita. Agora a linha e a
borda inferior de um paragrafo vazio: ela acompanha a largura da
coluna e o nome centraliza (quebrando em duas linhas se precisar).

A tabela das assinaturas tambem ficou 1 cm mais estreita que a
area util, com bordas explicitamente nil - antes o Word desenhava
o contorno das celulas - e o titulo RECIBO ganhou respiro em
relacao ao endereco.

Co-Authored-By: Claude Opus 5 (1M context) <noreply@anthropic.com>
</commit_message>
<xml_diff>
--- a/public/templates/recibo-capacete.docx
+++ b/public/templates/recibo-capacete.docx
@@ -45,7 +45,7 @@
     </w:p>
     <w:p>
       <w:pPr>
-        <w:spacing w:after="20" w:line="240" w:lineRule="auto"/>
+        <w:spacing w:before="0" w:after="20" w:line="240" w:lineRule="auto"/>
         <w:jc w:val="center"/>
       </w:pPr>
       <w:r>
@@ -62,7 +62,7 @@
     </w:p>
     <w:p>
       <w:pPr>
-        <w:spacing w:after="40" w:line="240" w:lineRule="auto"/>
+        <w:spacing w:before="0" w:after="40" w:line="240" w:lineRule="auto"/>
         <w:jc w:val="center"/>
       </w:pPr>
       <w:r>
@@ -77,7 +77,7 @@
     </w:p>
     <w:p>
       <w:pPr>
-        <w:spacing w:after="0" w:line="240" w:lineRule="auto"/>
+        <w:spacing w:before="160" w:after="0" w:line="240" w:lineRule="auto"/>
         <w:jc w:val="center"/>
       </w:pPr>
       <w:r>
@@ -102,7 +102,7 @@
     </w:p>
     <w:p>
       <w:pPr>
-        <w:spacing w:after="120" w:line="240" w:lineRule="auto"/>
+        <w:spacing w:before="0" w:after="120" w:line="240" w:lineRule="auto"/>
         <w:jc w:val="both"/>
       </w:pPr>
       <w:r>
@@ -117,7 +117,7 @@
     </w:p>
     <w:p>
       <w:pPr>
-        <w:spacing w:after="120" w:line="240" w:lineRule="auto"/>
+        <w:spacing w:before="0" w:after="120" w:line="240" w:lineRule="auto"/>
         <w:jc w:val="both"/>
       </w:pPr>
       <w:r>
@@ -132,7 +132,7 @@
     </w:p>
     <w:p>
       <w:pPr>
-        <w:spacing w:after="400" w:line="240" w:lineRule="auto"/>
+        <w:spacing w:before="0" w:after="400" w:line="240" w:lineRule="auto"/>
         <w:jc w:val="both"/>
       </w:pPr>
       <w:r>
@@ -147,49 +147,52 @@
     </w:p>
     <w:tbl>
       <w:tblPr>
-        <w:tblW w:w="10772" w:type="dxa"/>
+        <w:tblW w:w="10205" w:type="dxa"/>
         <w:jc w:val="center"/>
         <w:tblBorders>
-          <w:top w:val="none" w:sz="0" w:space="0" w:color="auto"/>
-          <w:left w:val="none" w:sz="0" w:space="0" w:color="auto"/>
-          <w:bottom w:val="none" w:sz="0" w:space="0" w:color="auto"/>
-          <w:right w:val="none" w:sz="0" w:space="0" w:color="auto"/>
-          <w:insideH w:val="none" w:sz="0" w:space="0" w:color="auto"/>
-          <w:insideV w:val="none" w:sz="0" w:space="0" w:color="auto"/>
+          <w:top w:val="nil"/>
+          <w:left w:val="nil"/>
+          <w:bottom w:val="nil"/>
+          <w:right w:val="nil"/>
+          <w:insideH w:val="nil"/>
+          <w:insideV w:val="nil"/>
         </w:tblBorders>
+        <w:tblCellMar>
+          <w:left w:w="113" w:type="dxa"/>
+          <w:right w:w="113" w:type="dxa"/>
+        </w:tblCellMar>
         <w:tblLayout w:type="fixed"/>
       </w:tblPr>
       <w:tblGrid>
-        <w:gridCol w:w="5386"/>
-        <w:gridCol w:w="5386"/>
+        <w:gridCol w:w="5102"/>
+        <w:gridCol w:w="5102"/>
       </w:tblGrid>
       <w:tr>
         <w:tc>
           <w:tcPr>
-            <w:tcW w:w="5386" w:type="dxa"/>
+            <w:tcW w:w="5102" w:type="dxa"/>
+            <w:tcBorders>
+              <w:top w:val="nil"/>
+              <w:left w:val="nil"/>
+              <w:bottom w:val="nil"/>
+              <w:right w:val="nil"/>
+            </w:tcBorders>
             <w:tcMar>
-              <w:left w:w="170" w:type="dxa"/>
-              <w:right w:w="170" w:type="dxa"/>
+              <w:left w:w="113" w:type="dxa"/>
+              <w:right w:w="113" w:type="dxa"/>
             </w:tcMar>
           </w:tcPr>
           <w:p>
             <w:pPr>
-              <w:spacing w:after="20" w:line="240" w:lineRule="auto"/>
-              <w:jc w:val="center"/>
-            </w:pPr>
-            <w:r>
-              <w:rPr>
-                <w:rFonts w:ascii="Arial" w:hAnsi="Arial" w:cs="Arial"/>
-                <w:color w:val="000000"/>
-                <w:sz w:val="18"/>
-                <w:szCs w:val="18"/>
-              </w:rPr>
-              <w:t xml:space="preserve">____________________________________</w:t>
-            </w:r>
-          </w:p>
-          <w:p>
-            <w:pPr>
-              <w:spacing w:after="0" w:line="240" w:lineRule="auto"/>
+              <w:spacing w:before="0" w:after="40" w:line="240" w:lineRule="auto"/>
+              <w:pBdr>
+                <w:bottom w:val="single" w:sz="6" w:space="1" w:color="000000"/>
+              </w:pBdr>
+            </w:pPr>
+          </w:p>
+          <w:p>
+            <w:pPr>
+              <w:spacing w:before="0" w:after="0" w:line="240" w:lineRule="auto"/>
               <w:jc w:val="center"/>
             </w:pPr>
             <w:r>
@@ -206,30 +209,29 @@
         </w:tc>
         <w:tc>
           <w:tcPr>
-            <w:tcW w:w="5386" w:type="dxa"/>
+            <w:tcW w:w="5102" w:type="dxa"/>
+            <w:tcBorders>
+              <w:top w:val="nil"/>
+              <w:left w:val="nil"/>
+              <w:bottom w:val="nil"/>
+              <w:right w:val="nil"/>
+            </w:tcBorders>
             <w:tcMar>
-              <w:left w:w="170" w:type="dxa"/>
-              <w:right w:w="170" w:type="dxa"/>
+              <w:left w:w="113" w:type="dxa"/>
+              <w:right w:w="113" w:type="dxa"/>
             </w:tcMar>
           </w:tcPr>
           <w:p>
             <w:pPr>
-              <w:spacing w:after="20" w:line="240" w:lineRule="auto"/>
-              <w:jc w:val="center"/>
-            </w:pPr>
-            <w:r>
-              <w:rPr>
-                <w:rFonts w:ascii="Arial" w:hAnsi="Arial" w:cs="Arial"/>
-                <w:color w:val="000000"/>
-                <w:sz w:val="18"/>
-                <w:szCs w:val="18"/>
-              </w:rPr>
-              <w:t xml:space="preserve">____________________________________</w:t>
-            </w:r>
-          </w:p>
-          <w:p>
-            <w:pPr>
-              <w:spacing w:after="0" w:line="240" w:lineRule="auto"/>
+              <w:spacing w:before="0" w:after="40" w:line="240" w:lineRule="auto"/>
+              <w:pBdr>
+                <w:bottom w:val="single" w:sz="6" w:space="1" w:color="000000"/>
+              </w:pBdr>
+            </w:pPr>
+          </w:p>
+          <w:p>
+            <w:pPr>
+              <w:spacing w:before="0" w:after="0" w:line="240" w:lineRule="auto"/>
               <w:jc w:val="center"/>
             </w:pPr>
             <w:r>
@@ -248,7 +250,7 @@
     </w:tbl>
     <w:p>
       <w:pPr>
-        <w:spacing w:after="0" w:line="240" w:lineRule="auto"/>
+        <w:spacing w:before="0" w:after="0" w:line="240" w:lineRule="auto"/>
         <w:jc w:val="center"/>
       </w:pPr>
       <w:r>

</xml_diff>

<commit_message>
Encolhe o recibo para um terco de A4
O recibo era A5 paisagem, que ocupava metade da folha para
pouca informacao. Agora sai em 21 x 9,9 cm: tres por folha A4,
o tamanho de talao de recibo mesmo.

Cabecalho, corpo e assinaturas foram reduzidos junto (logo de
1,9 para 1,2 cm, corpo de 9,5 para 8,5 pt) para o conteudo
continuar folgado na altura menor. Vale igual na tela de
impressao e no modelo Word.

Co-Authored-By: Claude Opus 5 (1M context) <noreply@anthropic.com>
</commit_message>
<xml_diff>
--- a/public/templates/recibo-capacete.docx
+++ b/public/templates/recibo-capacete.docx
@@ -10,7 +10,7 @@
       <w:r>
         <w:drawing>
           <wp:inline distT="0" distB="0" distL="0" distR="0">
-            <wp:extent cx="684000" cy="684000"/>
+            <wp:extent cx="432000" cy="432000"/>
             <wp:effectExtent l="0" t="0" r="0" b="0"/>
             <wp:docPr id="1" name="Logo Blackout Motos"/>
             <wp:cNvGraphicFramePr/>
@@ -30,7 +30,7 @@
                   <pic:spPr>
                     <a:xfrm>
                       <a:off x="0" y="0"/>
-                      <a:ext cx="684000" cy="684000"/>
+                      <a:ext cx="432000" cy="432000"/>
                     </a:xfrm>
                     <a:prstGeom prst="rect">
                       <a:avLst/>
@@ -45,39 +45,7 @@
     </w:p>
     <w:p>
       <w:pPr>
-        <w:spacing w:before="0" w:after="20" w:line="240" w:lineRule="auto"/>
-        <w:jc w:val="center"/>
-      </w:pPr>
-      <w:r>
-        <w:rPr>
-          <w:rFonts w:ascii="Arial" w:hAnsi="Arial" w:cs="Arial"/>
-          <w:b/>
-          <w:color w:val="000000"/>
-          <w:sz w:val="28"/>
-          <w:szCs w:val="28"/>
-          <w:spacing w:val="30"/>
-        </w:rPr>
-        <w:t xml:space="preserve">BLACKOUT MOTOS</w:t>
-      </w:r>
-    </w:p>
-    <w:p>
-      <w:pPr>
-        <w:spacing w:before="0" w:after="40" w:line="240" w:lineRule="auto"/>
-        <w:jc w:val="center"/>
-      </w:pPr>
-      <w:r>
-        <w:rPr>
-          <w:rFonts w:ascii="Arial" w:hAnsi="Arial" w:cs="Arial"/>
-          <w:color w:val="444444"/>
-          <w:sz w:val="15"/>
-          <w:szCs w:val="15"/>
-        </w:rPr>
-        <w:t xml:space="preserve">Avenida Andrômeda, 3521 - Bosque dos Eucaliptos - São José dos Campos/SP - CEP 12233-000</w:t>
-      </w:r>
-    </w:p>
-    <w:p>
-      <w:pPr>
-        <w:spacing w:before="160" w:after="0" w:line="240" w:lineRule="auto"/>
+        <w:spacing w:before="0" w:after="0" w:line="240" w:lineRule="auto"/>
         <w:jc w:val="center"/>
       </w:pPr>
       <w:r>
@@ -87,6 +55,38 @@
           <w:color w:val="000000"/>
           <w:sz w:val="24"/>
           <w:szCs w:val="24"/>
+          <w:spacing w:val="30"/>
+        </w:rPr>
+        <w:t xml:space="preserve">BLACKOUT MOTOS</w:t>
+      </w:r>
+    </w:p>
+    <w:p>
+      <w:pPr>
+        <w:spacing w:before="0" w:after="20" w:line="240" w:lineRule="auto"/>
+        <w:jc w:val="center"/>
+      </w:pPr>
+      <w:r>
+        <w:rPr>
+          <w:rFonts w:ascii="Arial" w:hAnsi="Arial" w:cs="Arial"/>
+          <w:color w:val="444444"/>
+          <w:sz w:val="13"/>
+          <w:szCs w:val="13"/>
+        </w:rPr>
+        <w:t xml:space="preserve">Avenida Andrômeda, 3521 - Bosque dos Eucaliptos - São José dos Campos/SP - CEP 12233-000</w:t>
+      </w:r>
+    </w:p>
+    <w:p>
+      <w:pPr>
+        <w:spacing w:before="60" w:after="0" w:line="240" w:lineRule="auto"/>
+        <w:jc w:val="center"/>
+      </w:pPr>
+      <w:r>
+        <w:rPr>
+          <w:rFonts w:ascii="Arial" w:hAnsi="Arial" w:cs="Arial"/>
+          <w:b/>
+          <w:color w:val="000000"/>
+          <w:sz w:val="20"/>
+          <w:szCs w:val="20"/>
           <w:spacing w:val="50"/>
         </w:rPr>
         <w:t xml:space="preserve">RECIBO</w:t>
@@ -94,7 +94,7 @@
     </w:p>
     <w:p>
       <w:pPr>
-        <w:spacing w:before="40" w:after="140"/>
+        <w:spacing w:before="20" w:after="90"/>
         <w:pBdr>
           <w:bottom w:val="single" w:sz="6" w:space="1" w:color="BBBBBB"/>
         </w:pBdr>
@@ -102,45 +102,45 @@
     </w:p>
     <w:p>
       <w:pPr>
-        <w:spacing w:before="0" w:after="120" w:line="240" w:lineRule="auto"/>
+        <w:spacing w:before="0" w:after="80" w:line="240" w:lineRule="auto"/>
         <w:jc w:val="both"/>
       </w:pPr>
       <w:r>
         <w:rPr>
           <w:rFonts w:ascii="Arial" w:hAnsi="Arial" w:cs="Arial"/>
           <w:color w:val="000000"/>
-          <w:sz w:val="19"/>
-          <w:szCs w:val="19"/>
+          <w:sz w:val="17"/>
+          <w:szCs w:val="17"/>
         </w:rPr>
         <w:t xml:space="preserve">Recebemos de {cliente_nome}, CPF {cliente_cpf}, telefone {cliente_telefone}, a quantia de {valor_total} ({valor_extenso}), referente à compra de {quantidade} unidade(s) de {produto}, marca {marca}, modelo {modelo}, cor {cor}, tamanho {tamanho}, ao valor unitário de {valor_unitario}.</w:t>
       </w:r>
     </w:p>
     <w:p>
       <w:pPr>
-        <w:spacing w:before="0" w:after="120" w:line="240" w:lineRule="auto"/>
+        <w:spacing w:before="0" w:after="80" w:line="240" w:lineRule="auto"/>
         <w:jc w:val="both"/>
       </w:pPr>
       <w:r>
         <w:rPr>
           <w:rFonts w:ascii="Arial" w:hAnsi="Arial" w:cs="Arial"/>
           <w:color w:val="000000"/>
-          <w:sz w:val="19"/>
-          <w:szCs w:val="19"/>
+          <w:sz w:val="17"/>
+          <w:szCs w:val="17"/>
         </w:rPr>
         <w:t xml:space="preserve">Forma de pagamento: {forma_pagamento}.</w:t>
       </w:r>
     </w:p>
     <w:p>
       <w:pPr>
-        <w:spacing w:before="0" w:after="400" w:line="240" w:lineRule="auto"/>
+        <w:spacing w:before="0" w:after="280" w:line="240" w:lineRule="auto"/>
         <w:jc w:val="both"/>
       </w:pPr>
       <w:r>
         <w:rPr>
           <w:rFonts w:ascii="Arial" w:hAnsi="Arial" w:cs="Arial"/>
           <w:color w:val="000000"/>
-          <w:sz w:val="19"/>
-          <w:szCs w:val="19"/>
+          <w:sz w:val="17"/>
+          <w:szCs w:val="17"/>
         </w:rPr>
         <w:t xml:space="preserve">São José dos Campos, {data_extenso}, às {hora_documento}.</w:t>
       </w:r>
@@ -200,8 +200,8 @@
                 <w:rFonts w:ascii="Arial" w:hAnsi="Arial" w:cs="Arial"/>
                 <w:b/>
                 <w:color w:val="000000"/>
-                <w:sz w:val="17"/>
-                <w:szCs w:val="17"/>
+                <w:sz w:val="15"/>
+                <w:szCs w:val="15"/>
               </w:rPr>
               <w:t xml:space="preserve">BLACKOUT MOTOS</w:t>
             </w:r>
@@ -239,8 +239,8 @@
                 <w:rFonts w:ascii="Arial" w:hAnsi="Arial" w:cs="Arial"/>
                 <w:b/>
                 <w:color w:val="000000"/>
-                <w:sz w:val="17"/>
-                <w:szCs w:val="17"/>
+                <w:sz w:val="15"/>
+                <w:szCs w:val="15"/>
               </w:rPr>
               <w:t xml:space="preserve">{cliente_nome}</w:t>
             </w:r>
@@ -250,22 +250,22 @@
     </w:tbl>
     <w:p>
       <w:pPr>
-        <w:spacing w:before="0" w:after="0" w:line="240" w:lineRule="auto"/>
+        <w:spacing w:before="60" w:after="0" w:line="240" w:lineRule="auto"/>
         <w:jc w:val="center"/>
       </w:pPr>
       <w:r>
         <w:rPr>
           <w:rFonts w:ascii="Arial" w:hAnsi="Arial" w:cs="Arial"/>
           <w:color w:val="666666"/>
-          <w:sz w:val="15"/>
-          <w:szCs w:val="15"/>
+          <w:sz w:val="13"/>
+          <w:szCs w:val="13"/>
         </w:rPr>
         <w:t xml:space="preserve">Vendedor: {vendedor}</w:t>
       </w:r>
     </w:p>
     <w:sectPr>
-      <w:pgSz w:w="11906" w:h="8391" w:orient="landscape"/>
-      <w:pgMar w:top="454" w:right="567" w:bottom="454" w:left="567" w:header="0" w:footer="0" w:gutter="0"/>
+      <w:pgSz w:w="11906" w:h="5613" w:orient="landscape"/>
+      <w:pgMar w:top="340" w:right="567" w:bottom="340" w:left="567" w:header="0" w:footer="0" w:gutter="0"/>
     </w:sectPr>
   </w:body>
 </w:document>

</xml_diff>

<commit_message>
Estica a logo do recibo na horizontal
A logo ficava quadrada em 1,2 cm e sobrava largura no cabecalho.
Agora sai em 2,4 x 1,2 cm, ocupando melhor a folha. O arquivo da
logo e quadrado, entao o desenho estica mesmo - foi a escolha
pedida. Vale na tela de impressao e no modelo Word.

Co-Authored-By: Claude Opus 5 (1M context) <noreply@anthropic.com>
</commit_message>
<xml_diff>
--- a/public/templates/recibo-capacete.docx
+++ b/public/templates/recibo-capacete.docx
@@ -10,7 +10,7 @@
       <w:r>
         <w:drawing>
           <wp:inline distT="0" distB="0" distL="0" distR="0">
-            <wp:extent cx="432000" cy="432000"/>
+            <wp:extent cx="864000" cy="432000"/>
             <wp:effectExtent l="0" t="0" r="0" b="0"/>
             <wp:docPr id="1" name="Logo Blackout Motos"/>
             <wp:cNvGraphicFramePr/>
@@ -30,7 +30,7 @@
                   <pic:spPr>
                     <a:xfrm>
                       <a:off x="0" y="0"/>
-                      <a:ext cx="432000" cy="432000"/>
+                      <a:ext cx="864000" cy="432000"/>
                     </a:xfrm>
                     <a:prstGeom prst="rect">
                       <a:avLst/>

</xml_diff>